<commit_message>
v3.0.0: extended analyses (capsule population, storage objective with five control families, design rule, Sobol), status-of-claims table, two new predictions
Co-Authored-By: Claude Sonnet 5.5 <noreply@anthropic.com>
</commit_message>
<xml_diff>
--- a/manuscript/AutoLatch_ChemRxiv_WileyMTS_Manuscript.docx
+++ b/manuscript/AutoLatch_ChemRxiv_WileyMTS_Manuscript.docx
@@ -3999,7 +3999,22 @@
         <w:rPr>
           <w:lang w:val="en-US"/>
         </w:rPr>
-        <w:t xml:space="preserve"> (concept DOI, always resolves to the latest version), and posted to ChemRxiv: [ChemRxiv DOI to be inserted by the author upon posting].</w:t>
+        <w:t xml:space="preserve"> (concept DOI, always resolves to the latest version), and posted to ChemRxiv: </w:t>
+      </w:r>
+      <w:hyperlink r:id="rId18">
+        <w:r>
+          <w:rPr>
+            <w:rStyle w:val="Hyperlink"/>
+            <w:lang w:val="en-US"/>
+          </w:rPr>
+          <w:t>https://doi.org/10.26434/chemrxiv.15008366/v1</w:t>
+        </w:r>
+      </w:hyperlink>
+      <w:r>
+        <w:rPr>
+          <w:lang w:val="en-US"/>
+        </w:rPr>
+        <w:t xml:space="preserve">.</w:t>
       </w:r>
     </w:p>
     <w:p>

</xml_diff>